<commit_message>
chore: add generated templates and material icon assets
</commit_message>
<xml_diff>
--- a/Models/2026-03_Attestation-Domiciliation-Initiale_Template.docx
+++ b/Models/2026-03_Attestation-Domiciliation-Initiale_Template.docx
@@ -30,7 +30,7 @@
           <w14:ligatures w14:val="standardContextual"/>
         </w:rPr>
         <w:drawing>
-          <wp:anchor distT="0" distB="0" distL="114300" distR="114300" simplePos="0" relativeHeight="251658240" behindDoc="1" locked="0" layoutInCell="1" allowOverlap="1" wp14:anchorId="00A8EE55" wp14:editId="67B4E5FE">
+          <wp:anchor distT="0" distB="0" distL="114300" distR="114300" simplePos="0" relativeHeight="251658240" behindDoc="1" locked="0" layoutInCell="1" allowOverlap="1" wp14:anchorId="00A8EE55" wp14:editId="12A03B40">
             <wp:simplePos x="0" y="0"/>
             <wp:positionH relativeFrom="column">
               <wp:posOffset>2173605</wp:posOffset>
@@ -38,8 +38,8 @@
             <wp:positionV relativeFrom="paragraph">
               <wp:posOffset>230505</wp:posOffset>
             </wp:positionV>
-            <wp:extent cx="1526540" cy="1526540"/>
-            <wp:effectExtent l="0" t="0" r="0" b="0"/>
+            <wp:extent cx="1254760" cy="1254760"/>
+            <wp:effectExtent l="0" t="0" r="2540" b="2540"/>
             <wp:wrapTopAndBottom/>
             <wp:docPr id="780628750" name="Graphique 2"/>
             <wp:cNvGraphicFramePr>
@@ -67,7 +67,7 @@
                   <pic:spPr>
                     <a:xfrm>
                       <a:off x="0" y="0"/>
-                      <a:ext cx="1526540" cy="1526540"/>
+                      <a:ext cx="1254760" cy="1254760"/>
                     </a:xfrm>
                     <a:prstGeom prst="flowChartAlternateProcess">
                       <a:avLst/>
@@ -133,6 +133,35 @@
     <w:p>
       <w:pPr>
         <w:spacing w:after="0" w:line="240" w:lineRule="auto"/>
+        <w:jc w:val="center"/>
+        <w:rPr>
+          <w:rFonts w:ascii="Times New Roman" w:hAnsi="Times New Roman"/>
+          <w:b/>
+          <w:bCs/>
+          <w:color w:val="345E0A"/>
+          <w:sz w:val="40"/>
+          <w:szCs w:val="40"/>
+          <w:u w:val="double"/>
+          <w:lang w:val="fr-FR"/>
+        </w:rPr>
+      </w:pPr>
+      <w:r>
+        <w:rPr>
+          <w:rFonts w:ascii="Times New Roman" w:hAnsi="Times New Roman"/>
+          <w:b/>
+          <w:bCs/>
+          <w:color w:val="345E0A"/>
+          <w:sz w:val="40"/>
+          <w:szCs w:val="40"/>
+          <w:u w:val="double"/>
+          <w:lang w:val="fr-FR"/>
+        </w:rPr>
+        <w:t>({{CONTRAT_FORME_JURIDIQUE}})</w:t>
+      </w:r>
+    </w:p>
+    <w:p>
+      <w:pPr>
+        <w:spacing w:after="0" w:line="240" w:lineRule="auto"/>
         <w:jc w:val="both"/>
         <w:rPr>
           <w:rFonts w:ascii="Times New Roman" w:hAnsi="Times New Roman"/>
@@ -291,63 +320,60 @@
           <w:color w:val="385623" w:themeColor="accent6" w:themeShade="80"/>
           <w:sz w:val="24"/>
           <w:szCs w:val="24"/>
-          <w:lang w:val="fr-FR"/>
-        </w:rPr>
-      </w:pPr>
-      <w:r>
-        <w:rPr>
-          <w:rFonts w:ascii="Times New Roman" w:hAnsi="Times New Roman"/>
-          <w:b/>
-          <w:bCs/>
-          <w:sz w:val="24"/>
-          <w:szCs w:val="24"/>
-          <w:lang w:val="fr-FR"/>
-        </w:rPr>
-        <w:t xml:space="preserve">NUMERO_ICE : </w:t>
-      </w:r>
-      <w:r>
-        <w:rPr>
-          <w:rFonts w:ascii="Times New Roman" w:hAnsi="Times New Roman"/>
-          <w:b/>
-          <w:bCs/>
-          <w:color w:val="385623" w:themeColor="accent6" w:themeShade="80"/>
-          <w:sz w:val="24"/>
-          <w:szCs w:val="24"/>
-          <w:lang w:val="fr-FR"/>
-        </w:rPr>
-        <w:t>003829326000013</w:t>
-      </w:r>
-      <w:r>
-        <w:rPr>
-          <w:rFonts w:ascii="Times New Roman" w:hAnsi="Times New Roman"/>
-          <w:b/>
-          <w:bCs/>
-          <w:color w:val="385623" w:themeColor="accent6" w:themeShade="80"/>
-          <w:sz w:val="24"/>
-          <w:szCs w:val="24"/>
-          <w:lang w:val="fr-FR"/>
-        </w:rPr>
-        <w:t xml:space="preserve">     </w:t>
-      </w:r>
-      <w:r>
-        <w:rPr>
-          <w:rFonts w:ascii="Times New Roman" w:hAnsi="Times New Roman"/>
-          <w:b/>
-          <w:bCs/>
-          <w:sz w:val="24"/>
-          <w:szCs w:val="24"/>
-          <w:lang w:val="fr-FR"/>
+        </w:rPr>
+      </w:pPr>
+      <w:proofErr w:type="gramStart"/>
+      <w:r>
+        <w:rPr>
+          <w:rFonts w:ascii="Times New Roman" w:hAnsi="Times New Roman"/>
+          <w:b/>
+          <w:bCs/>
+          <w:sz w:val="24"/>
+          <w:szCs w:val="24"/>
+        </w:rPr>
+        <w:t>ICE :</w:t>
+      </w:r>
+      <w:proofErr w:type="gramEnd"/>
+      <w:r>
+        <w:rPr>
+          <w:rFonts w:ascii="Times New Roman" w:hAnsi="Times New Roman"/>
+          <w:b/>
+          <w:bCs/>
+          <w:sz w:val="24"/>
+          <w:szCs w:val="24"/>
+        </w:rPr>
+        <w:t xml:space="preserve"> </w:t>
+      </w:r>
+      <w:r>
+        <w:rPr>
+          <w:rFonts w:ascii="Times New Roman" w:hAnsi="Times New Roman"/>
+          <w:b/>
+          <w:bCs/>
+          <w:color w:val="385623" w:themeColor="accent6" w:themeShade="80"/>
+          <w:sz w:val="24"/>
+          <w:szCs w:val="24"/>
+        </w:rPr>
+        <w:t xml:space="preserve">003829326000013     </w:t>
+      </w:r>
+      <w:proofErr w:type="gramStart"/>
+      <w:r>
+        <w:rPr>
+          <w:rFonts w:ascii="Times New Roman" w:hAnsi="Times New Roman"/>
+          <w:b/>
+          <w:bCs/>
+          <w:sz w:val="24"/>
+          <w:szCs w:val="24"/>
         </w:rPr>
         <w:t>TP :</w:t>
       </w:r>
-      <w:r>
-        <w:rPr>
-          <w:rFonts w:ascii="Times New Roman" w:hAnsi="Times New Roman"/>
-          <w:b/>
-          <w:bCs/>
-          <w:sz w:val="24"/>
-          <w:szCs w:val="24"/>
-          <w:lang w:val="fr-FR"/>
+      <w:proofErr w:type="gramEnd"/>
+      <w:r>
+        <w:rPr>
+          <w:rFonts w:ascii="Times New Roman" w:hAnsi="Times New Roman"/>
+          <w:b/>
+          <w:bCs/>
+          <w:sz w:val="24"/>
+          <w:szCs w:val="24"/>
         </w:rPr>
         <w:t xml:space="preserve"> </w:t>
       </w:r>
@@ -359,42 +385,39 @@
           <w:color w:val="385623" w:themeColor="accent6" w:themeShade="80"/>
           <w:sz w:val="24"/>
           <w:szCs w:val="24"/>
-          <w:lang w:val="fr-FR"/>
-        </w:rPr>
-        <w:t>34011285</w:t>
-      </w:r>
-      <w:r>
-        <w:rPr>
-          <w:rFonts w:ascii="Times New Roman" w:hAnsi="Times New Roman"/>
-          <w:b/>
-          <w:bCs/>
-          <w:color w:val="385623" w:themeColor="accent6" w:themeShade="80"/>
-          <w:sz w:val="24"/>
-          <w:szCs w:val="24"/>
-          <w:lang w:val="fr-FR"/>
-        </w:rPr>
-        <w:t xml:space="preserve">    </w:t>
-      </w:r>
-      <w:r>
-        <w:rPr>
-          <w:rFonts w:ascii="Times New Roman" w:hAnsi="Times New Roman"/>
-          <w:b/>
-          <w:bCs/>
-          <w:sz w:val="24"/>
-          <w:szCs w:val="24"/>
-          <w:lang w:val="fr-FR"/>
-        </w:rPr>
-        <w:t xml:space="preserve">IF : </w:t>
-      </w:r>
-      <w:r>
-        <w:rPr>
-          <w:rFonts w:ascii="Times New Roman" w:hAnsi="Times New Roman"/>
-          <w:b/>
-          <w:bCs/>
-          <w:color w:val="385623" w:themeColor="accent6" w:themeShade="80"/>
-          <w:sz w:val="24"/>
-          <w:szCs w:val="24"/>
-          <w:lang w:val="fr-FR"/>
+        </w:rPr>
+        <w:t xml:space="preserve">34011285    </w:t>
+      </w:r>
+      <w:proofErr w:type="gramStart"/>
+      <w:r>
+        <w:rPr>
+          <w:rFonts w:ascii="Times New Roman" w:hAnsi="Times New Roman"/>
+          <w:b/>
+          <w:bCs/>
+          <w:sz w:val="24"/>
+          <w:szCs w:val="24"/>
+        </w:rPr>
+        <w:t>IF :</w:t>
+      </w:r>
+      <w:proofErr w:type="gramEnd"/>
+      <w:r>
+        <w:rPr>
+          <w:rFonts w:ascii="Times New Roman" w:hAnsi="Times New Roman"/>
+          <w:b/>
+          <w:bCs/>
+          <w:sz w:val="24"/>
+          <w:szCs w:val="24"/>
+        </w:rPr>
+        <w:t xml:space="preserve"> </w:t>
+      </w:r>
+      <w:r>
+        <w:rPr>
+          <w:rFonts w:ascii="Times New Roman" w:hAnsi="Times New Roman"/>
+          <w:b/>
+          <w:bCs/>
+          <w:color w:val="385623" w:themeColor="accent6" w:themeShade="80"/>
+          <w:sz w:val="24"/>
+          <w:szCs w:val="24"/>
         </w:rPr>
         <w:t>68834734</w:t>
       </w:r>
@@ -406,7 +429,6 @@
           <w:color w:val="385623" w:themeColor="accent6" w:themeShade="80"/>
           <w:sz w:val="24"/>
           <w:szCs w:val="24"/>
-          <w:lang w:val="fr-FR"/>
         </w:rPr>
         <w:tab/>
       </w:r>
@@ -418,7 +440,6 @@
           <w:color w:val="385623" w:themeColor="accent6" w:themeShade="80"/>
           <w:sz w:val="24"/>
           <w:szCs w:val="24"/>
-          <w:lang w:val="fr-FR"/>
         </w:rPr>
         <w:t xml:space="preserve">   </w:t>
       </w:r>
@@ -430,30 +451,39 @@
           <w:color w:val="385623" w:themeColor="accent6" w:themeShade="80"/>
           <w:sz w:val="24"/>
           <w:szCs w:val="24"/>
-          <w:lang w:val="fr-FR"/>
         </w:rPr>
         <w:t xml:space="preserve"> </w:t>
       </w:r>
-      <w:r>
-        <w:rPr>
-          <w:rFonts w:ascii="Times New Roman" w:hAnsi="Times New Roman"/>
-          <w:b/>
-          <w:bCs/>
-          <w:sz w:val="24"/>
-          <w:szCs w:val="24"/>
-          <w:lang w:val="fr-FR"/>
-        </w:rPr>
-        <w:t xml:space="preserve">RC : </w:t>
-      </w:r>
-      <w:r>
-        <w:rPr>
-          <w:rFonts w:ascii="Times New Roman" w:hAnsi="Times New Roman"/>
-          <w:b/>
-          <w:bCs/>
-          <w:color w:val="385623" w:themeColor="accent6" w:themeShade="80"/>
-          <w:sz w:val="24"/>
-          <w:szCs w:val="24"/>
-          <w:lang w:val="fr-FR"/>
+      <w:proofErr w:type="gramStart"/>
+      <w:r>
+        <w:rPr>
+          <w:rFonts w:ascii="Times New Roman" w:hAnsi="Times New Roman"/>
+          <w:b/>
+          <w:bCs/>
+          <w:sz w:val="24"/>
+          <w:szCs w:val="24"/>
+        </w:rPr>
+        <w:t>RC :</w:t>
+      </w:r>
+      <w:proofErr w:type="gramEnd"/>
+      <w:r>
+        <w:rPr>
+          <w:rFonts w:ascii="Times New Roman" w:hAnsi="Times New Roman"/>
+          <w:b/>
+          <w:bCs/>
+          <w:sz w:val="24"/>
+          <w:szCs w:val="24"/>
+        </w:rPr>
+        <w:t xml:space="preserve"> </w:t>
+      </w:r>
+      <w:r>
+        <w:rPr>
+          <w:rFonts w:ascii="Times New Roman" w:hAnsi="Times New Roman"/>
+          <w:b/>
+          <w:bCs/>
+          <w:color w:val="385623" w:themeColor="accent6" w:themeShade="80"/>
+          <w:sz w:val="24"/>
+          <w:szCs w:val="24"/>
         </w:rPr>
         <w:t>705161</w:t>
       </w:r>
@@ -500,7 +530,38 @@
           <w:szCs w:val="24"/>
           <w:lang w:val="fr-FR"/>
         </w:rPr>
-        <w:t xml:space="preserve">, NUMERO_ICE N° </w:t>
+        <w:t xml:space="preserve">, </w:t>
+      </w:r>
+      <w:r>
+        <w:rPr>
+          <w:rFonts w:ascii="Times New Roman" w:hAnsi="Times New Roman"/>
+          <w:sz w:val="24"/>
+          <w:szCs w:val="24"/>
+          <w:lang w:val="fr-FR"/>
+        </w:rPr>
+        <w:t>sous</w:t>
+      </w:r>
+      <w:r>
+        <w:rPr>
+          <w:rFonts w:ascii="Times New Roman" w:hAnsi="Times New Roman"/>
+          <w:b/>
+          <w:bCs/>
+          <w:sz w:val="24"/>
+          <w:szCs w:val="24"/>
+          <w:lang w:val="fr-FR"/>
+        </w:rPr>
+        <w:t xml:space="preserve"> l’</w:t>
+      </w:r>
+      <w:r>
+        <w:rPr>
+          <w:rFonts w:ascii="Times New Roman" w:hAnsi="Times New Roman"/>
+          <w:b/>
+          <w:bCs/>
+          <w:sz w:val="24"/>
+          <w:szCs w:val="24"/>
+          <w:lang w:val="fr-FR"/>
+        </w:rPr>
+        <w:t xml:space="preserve">ICE N° </w:t>
       </w:r>
       <w:r>
         <w:rPr>

</xml_diff>